<commit_message>
docs(manuals): name the ports as labelled on the device, PWR/PC and PEN
The manuals called the scanner port "USB" and the power port "PWR", but the
device is labelled PEN and PWR/PC -- and both ports are USB.  The user
manual (connection steps, display table, quick guide, troubleshooting),
figure 2 (connection) and figure 6 (troubleshooting) and the photo brief B2
in the admin manual now use the labels.  Also replaces "brotoget", a
non-word for the device in figures 1-3, with "boksen" as in the text.

Both manuals and the personal admin variant rebuilt; figures regenerated.

Co-Authored-By: Claude Opus 5.5 (1M context) <noreply@anthropic.com>
</commit_message>
<xml_diff>
--- a/docs/manuals/Brugermanual_IPR_Pen_Bridge.docx
+++ b/docs/manuals/Brugermanual_IPR_Pen_Bridge.docx
@@ -1059,7 +1059,7 @@
           <w:rFonts w:ascii="Segoe UI" w:hAnsi="Segoe UI"/>
           <w:sz w:val="21"/>
         </w:rPr>
-        <w:t>Brug PWR-porten. Lampen blinker hvidt, mens boksen starter op.</w:t>
+        <w:t>Brug porten mærket PWR/PC. Lampen blinker hvidt, mens boksen starter op.</w:t>
       </w:r>
     </w:p>
     <w:p>
@@ -1099,7 +1099,7 @@
           <w:rFonts w:ascii="Segoe UI" w:hAnsi="Segoe UI"/>
           <w:sz w:val="21"/>
         </w:rPr>
-        <w:t>Brug USB-porten på boksen — ikke PWR-porten.</w:t>
+        <w:t>Brug porten mærket PEN på boksen — ikke PWR/PC-porten.</w:t>
       </w:r>
     </w:p>
     <w:p>
@@ -4274,7 +4274,7 @@
                 <w:rFonts w:ascii="Segoe UI" w:hAnsi="Segoe UI"/>
                 <w:sz w:val="19"/>
               </w:rPr>
-              <w:t>En linje har et ✗ og siger, hvad der er galt med selve boksen: pennens USB-port slået fra, en tjeneste stoppet. Det er ikke noget, du selv retter — kontakt administratoren.</w:t>
+              <w:t>En linje har et ✗ og siger, hvad der er galt med selve boksen: PEN-porten slået fra, en tjeneste stoppet. Det er ikke noget, du selv retter — kontakt administratoren.</w:t>
             </w:r>
           </w:p>
         </w:tc>
@@ -6551,7 +6551,7 @@
           <w:rFonts w:ascii="Segoe UI" w:hAnsi="Segoe UI"/>
           <w:sz w:val="21"/>
         </w:rPr>
-        <w:t>Strøm i PWR-porten → vent 1 minut.</w:t>
+        <w:t>Strøm i PWR/PC-porten → vent 1 minut.</w:t>
       </w:r>
     </w:p>
     <w:p>
@@ -6563,7 +6563,7 @@
           <w:rFonts w:ascii="Segoe UI" w:hAnsi="Segoe UI"/>
           <w:sz w:val="21"/>
         </w:rPr>
-        <w:t>Skanner i USB-porten.</w:t>
+        <w:t>Skanner i PEN-porten.</w:t>
       </w:r>
     </w:p>
     <w:p>
@@ -6908,7 +6908,7 @@
           <w:rFonts w:ascii="Segoe UI" w:hAnsi="Segoe UI"/>
           <w:sz w:val="21"/>
         </w:rPr>
-        <w:t>Er skanneren sat i USB-porten?</w:t>
+        <w:t>Er skanneren sat i PEN-porten?</w:t>
       </w:r>
     </w:p>
     <w:p>

</xml_diff>